<commit_message>
Add demo agents, GHL notes, and update gitignore
</commit_message>
<xml_diff>
--- a/Requirements/ALLIANCE KNOW BASE, FAQS, SCENARIOS.docx
+++ b/Requirements/ALLIANCE KNOW BASE, FAQS, SCENARIOS.docx
@@ -166,7 +166,7 @@
     <w:p>
       <w:r>
         <w:pict w14:anchorId="4C5A018C">
-          <v:rect id="_x0000_i1164" style="width:0;height:1.5pt" o:hralign="center" o:hrstd="t" o:hr="t" fillcolor="#a0a0a0" stroked="f"/>
+          <v:rect id="_x0000_i1025" style="width:0;height:1.5pt" o:hralign="center" o:hrstd="t" o:hr="t" fillcolor="#a0a0a0" stroked="f"/>
         </w:pict>
       </w:r>
     </w:p>
@@ -636,7 +636,7 @@
     <w:p>
       <w:r>
         <w:pict w14:anchorId="399FC931">
-          <v:rect id="_x0000_i1165" style="width:0;height:1.5pt" o:hralign="center" o:hrstd="t" o:hr="t" fillcolor="#a0a0a0" stroked="f"/>
+          <v:rect id="_x0000_i1026" style="width:0;height:1.5pt" o:hralign="center" o:hrstd="t" o:hr="t" fillcolor="#a0a0a0" stroked="f"/>
         </w:pict>
       </w:r>
     </w:p>
@@ -1010,7 +1010,7 @@
     <w:p>
       <w:r>
         <w:pict w14:anchorId="15131D48">
-          <v:rect id="_x0000_i1166" style="width:0;height:1.5pt" o:hralign="center" o:hrstd="t" o:hr="t" fillcolor="#a0a0a0" stroked="f"/>
+          <v:rect id="_x0000_i1027" style="width:0;height:1.5pt" o:hralign="center" o:hrstd="t" o:hr="t" fillcolor="#a0a0a0" stroked="f"/>
         </w:pict>
       </w:r>
     </w:p>
@@ -1296,13 +1296,8 @@
           <w:numId w:val="16"/>
         </w:numPr>
       </w:pPr>
-      <w:proofErr w:type="spellStart"/>
-      <w:r>
-        <w:t>Favorable</w:t>
-      </w:r>
-      <w:proofErr w:type="spellEnd"/>
-      <w:r>
-        <w:t xml:space="preserve"> return potential</w:t>
+      <w:r>
+        <w:t>Favorable return potential</w:t>
       </w:r>
     </w:p>
     <w:p>
@@ -1397,7 +1392,7 @@
     <w:p>
       <w:r>
         <w:pict w14:anchorId="22640564">
-          <v:rect id="_x0000_i1167" style="width:0;height:1.5pt" o:hralign="center" o:hrstd="t" o:hr="t" fillcolor="#a0a0a0" stroked="f"/>
+          <v:rect id="_x0000_i1028" style="width:0;height:1.5pt" o:hralign="center" o:hrstd="t" o:hr="t" fillcolor="#a0a0a0" stroked="f"/>
         </w:pict>
       </w:r>
     </w:p>
@@ -1759,7 +1754,7 @@
     <w:p>
       <w:r>
         <w:pict w14:anchorId="12411230">
-          <v:rect id="_x0000_i1168" style="width:0;height:1.5pt" o:hralign="center" o:hrstd="t" o:hr="t" fillcolor="#a0a0a0" stroked="f"/>
+          <v:rect id="_x0000_i1029" style="width:0;height:1.5pt" o:hralign="center" o:hrstd="t" o:hr="t" fillcolor="#a0a0a0" stroked="f"/>
         </w:pict>
       </w:r>
     </w:p>
@@ -1936,7 +1931,7 @@
     <w:p>
       <w:r>
         <w:pict w14:anchorId="02812455">
-          <v:rect id="_x0000_i1169" style="width:0;height:1.5pt" o:hralign="center" o:hrstd="t" o:hr="t" fillcolor="#a0a0a0" stroked="f"/>
+          <v:rect id="_x0000_i1030" style="width:0;height:1.5pt" o:hralign="center" o:hrstd="t" o:hr="t" fillcolor="#a0a0a0" stroked="f"/>
         </w:pict>
       </w:r>
     </w:p>
@@ -2018,10 +2013,51 @@
         <w:spacing w:before="300" w:after="300"/>
       </w:pPr>
       <w:r>
-        <w:t xml:space="preserve">“Hi [First Name], this is [Agent Name] calling with Alliance Portfolio. We work with brokers on private money and hard money loan scenarios throughout </w:t>
-      </w:r>
-      <w:r>
-        <w:t>Orange County, coastal Los Angeles, San Diego County, and select Bay Area markets.</w:t>
+        <w:t xml:space="preserve">“Hi [First Name], this is </w:t>
+      </w:r>
+      <w:r>
+        <w:t xml:space="preserve">Jim </w:t>
+      </w:r>
+      <w:r>
+        <w:t>with Alliance Portfolio</w:t>
+      </w:r>
+      <w:r>
+        <w:t xml:space="preserve">. We are a direct private money lender in Orange </w:t>
+      </w:r>
+      <w:proofErr w:type="gramStart"/>
+      <w:r>
+        <w:t>County</w:t>
+      </w:r>
+      <w:proofErr w:type="gramEnd"/>
+      <w:r>
+        <w:t xml:space="preserve"> and we </w:t>
+      </w:r>
+      <w:r>
+        <w:t>ha</w:t>
+      </w:r>
+      <w:r>
+        <w:t>ve</w:t>
+      </w:r>
+      <w:r>
+        <w:t xml:space="preserve"> a ton of capital to deploy into good quality </w:t>
+      </w:r>
+      <w:r>
+        <w:t>business</w:t>
+      </w:r>
+      <w:r>
+        <w:t xml:space="preserve"> and investment </w:t>
+      </w:r>
+      <w:r>
+        <w:t xml:space="preserve">purpose </w:t>
+      </w:r>
+      <w:r>
+        <w:t>hard money</w:t>
+      </w:r>
+      <w:r>
+        <w:t xml:space="preserve"> loans.</w:t>
+      </w:r>
+      <w:r>
+        <w:t xml:space="preserve"> Do you have anything like that I can help you with?</w:t>
       </w:r>
       <w:r>
         <w:t>”</w:t>
@@ -2030,36 +2066,43 @@
     <w:p>
       <w:pPr>
         <w:spacing w:before="300" w:after="300"/>
-      </w:pPr>
-      <w:r>
-        <w:t>Pause.</w:t>
-      </w:r>
-    </w:p>
-    <w:p>
-      <w:pPr>
-        <w:spacing w:before="300" w:after="300"/>
-      </w:pPr>
-      <w:r>
-        <w:t xml:space="preserve">“I wanted to connect briefly because Alliance </w:t>
-      </w:r>
-      <w:r>
-        <w:t xml:space="preserve">Portfolio currently has a ton of capital to deploy into good quality </w:t>
-      </w:r>
-      <w:r>
-        <w:t>business</w:t>
-      </w:r>
-      <w:r>
-        <w:t xml:space="preserve"> and investment </w:t>
-      </w:r>
-      <w:r>
-        <w:t xml:space="preserve">purpose </w:t>
-      </w:r>
-      <w:r>
-        <w:t>hard money</w:t>
-      </w:r>
-      <w:r>
-        <w:t xml:space="preserve"> loans.”</w:t>
-      </w:r>
+        <w:rPr>
+          <w:b/>
+          <w:bCs/>
+        </w:rPr>
+      </w:pPr>
+      <w:r>
+        <w:rPr>
+          <w:b/>
+          <w:bCs/>
+        </w:rPr>
+        <w:t>Alternative opening:</w:t>
+      </w:r>
+    </w:p>
+    <w:p>
+      <w:pPr>
+        <w:spacing w:before="300" w:after="300"/>
+      </w:pPr>
+      <w:r>
+        <w:t xml:space="preserve">Hi [First Name], this is </w:t>
+      </w:r>
+      <w:r>
+        <w:t>Ruben</w:t>
+      </w:r>
+      <w:r>
+        <w:t xml:space="preserve"> with Alliance Portfolio</w:t>
+      </w:r>
+      <w:r>
+        <w:t>. We are one of the largest hard money lenders in California with our own funds. Do you have any hard money deals right now that you need help with</w:t>
+      </w:r>
+      <w:r>
+        <w:t>?</w:t>
+      </w:r>
+    </w:p>
+    <w:p>
+      <w:pPr>
+        <w:spacing w:before="300" w:after="300"/>
+      </w:pPr>
     </w:p>
     <w:p>
       <w:pPr>
@@ -2093,14 +2136,6 @@
         <w:spacing w:before="300" w:after="300"/>
       </w:pPr>
       <w:r>
-        <w:t>“Are you currently working with any deals that are difficult to place?”</w:t>
-      </w:r>
-    </w:p>
-    <w:p>
-      <w:pPr>
-        <w:spacing w:before="300" w:after="300"/>
-      </w:pPr>
-      <w:r>
         <w:t>If yes:</w:t>
       </w:r>
     </w:p>
@@ -2109,10 +2144,39 @@
         <w:spacing w:before="300" w:after="300"/>
       </w:pPr>
       <w:r>
-        <w:t>“Got it. What type of property is</w:t>
-      </w:r>
-      <w:r>
-        <w:t xml:space="preserve"> it</w:t>
+        <w:t>“</w:t>
+      </w:r>
+      <w:r>
+        <w:t>Great”</w:t>
+      </w:r>
+      <w:r>
+        <w:t xml:space="preserve">. </w:t>
+      </w:r>
+      <w:r>
+        <w:t>Where is the property located?”</w:t>
+      </w:r>
+    </w:p>
+    <w:p>
+      <w:pPr>
+        <w:spacing w:before="300" w:after="300"/>
+      </w:pPr>
+      <w:r>
+        <w:t>Follow-up questions:</w:t>
+      </w:r>
+    </w:p>
+    <w:p>
+      <w:pPr>
+        <w:numPr>
+          <w:ilvl w:val="0"/>
+          <w:numId w:val="6"/>
+        </w:numPr>
+        <w:spacing w:before="300"/>
+      </w:pPr>
+      <w:r>
+        <w:t>“</w:t>
+      </w:r>
+      <w:r>
+        <w:t>What type of property is it</w:t>
       </w:r>
       <w:r>
         <w:t>?”</w:t>
@@ -2120,22 +2184,19 @@
     </w:p>
     <w:p>
       <w:pPr>
-        <w:spacing w:before="300" w:after="300"/>
-      </w:pPr>
-      <w:r>
-        <w:t>Follow-up questions:</w:t>
-      </w:r>
-    </w:p>
-    <w:p>
-      <w:pPr>
         <w:numPr>
           <w:ilvl w:val="0"/>
           <w:numId w:val="6"/>
         </w:numPr>
-        <w:spacing w:before="300"/>
-      </w:pPr>
-      <w:r>
-        <w:t>“Where is the property located?”</w:t>
+      </w:pPr>
+      <w:r>
+        <w:t xml:space="preserve">“What is the </w:t>
+      </w:r>
+      <w:r>
+        <w:t>property worth</w:t>
+      </w:r>
+      <w:r>
+        <w:t>?”</w:t>
       </w:r>
     </w:p>
     <w:p>
@@ -2146,7 +2207,13 @@
         </w:numPr>
       </w:pPr>
       <w:r>
-        <w:t>“What is the estimated property value?”</w:t>
+        <w:t xml:space="preserve">“What </w:t>
+      </w:r>
+      <w:r>
+        <w:t>do they</w:t>
+      </w:r>
+      <w:r>
+        <w:t xml:space="preserve"> owe?”</w:t>
       </w:r>
     </w:p>
     <w:p>
@@ -2157,7 +2224,7 @@
         </w:numPr>
       </w:pPr>
       <w:r>
-        <w:t>“How much are they looking to borrow?”</w:t>
+        <w:t>“How much do they want?”</w:t>
       </w:r>
     </w:p>
     <w:p>
@@ -2168,7 +2235,7 @@
         </w:numPr>
       </w:pPr>
       <w:r>
-        <w:t>“What is currently owed, if anything?”</w:t>
+        <w:t>“What will the funds be used for?”</w:t>
       </w:r>
     </w:p>
     <w:p>
@@ -2177,33 +2244,16 @@
           <w:ilvl w:val="0"/>
           <w:numId w:val="6"/>
         </w:numPr>
-      </w:pPr>
-      <w:r>
-        <w:t>“What will the funds be used for?”</w:t>
-      </w:r>
-    </w:p>
-    <w:p>
-      <w:pPr>
-        <w:numPr>
-          <w:ilvl w:val="0"/>
-          <w:numId w:val="6"/>
-        </w:numPr>
         <w:spacing w:after="300"/>
       </w:pPr>
       <w:r>
-        <w:t>“How quickly are they trying to close?”</w:t>
-      </w:r>
-    </w:p>
-    <w:p>
-      <w:pPr>
-        <w:numPr>
-          <w:ilvl w:val="0"/>
-          <w:numId w:val="6"/>
-        </w:numPr>
-        <w:spacing w:after="300"/>
-      </w:pPr>
-      <w:r>
-        <w:t>“Who occupies the property?”</w:t>
+        <w:t>“</w:t>
+      </w:r>
+      <w:r>
+        <w:t>When do they want to</w:t>
+      </w:r>
+      <w:r>
+        <w:t xml:space="preserve"> close?”</w:t>
       </w:r>
     </w:p>
     <w:p>
@@ -2318,7 +2368,19 @@
       <w:bookmarkStart w:id="13" w:name="_39x40x6b4kf3" w:colFirst="0" w:colLast="0"/>
       <w:bookmarkEnd w:id="13"/>
       <w:r>
-        <w:t>“This sounds good. Let me connect you to a live body that can get you started.”</w:t>
+        <w:t xml:space="preserve">“This sounds good. </w:t>
+      </w:r>
+      <w:r>
+        <w:t xml:space="preserve">I </w:t>
+      </w:r>
+      <w:r>
+        <w:t xml:space="preserve">will </w:t>
+      </w:r>
+      <w:r>
+        <w:t xml:space="preserve">connect you with </w:t>
+      </w:r>
+      <w:r>
+        <w:t>a representative that can help you.”</w:t>
       </w:r>
     </w:p>
     <w:p>
@@ -2364,13 +2426,10 @@
       </w:r>
       <w:r>
         <w:br/>
-        <w:t xml:space="preserve"> “I can connect you with someone from the Alliance </w:t>
-      </w:r>
-      <w:r>
-        <w:t xml:space="preserve">Portfolio </w:t>
-      </w:r>
-      <w:r>
-        <w:t>team now to review the scenario.”</w:t>
+        <w:t xml:space="preserve"> “</w:t>
+      </w:r>
+      <w:r>
+        <w:t>This sounds good. I will connect you with a representative that can help you.”</w:t>
       </w:r>
     </w:p>
     <w:p>
@@ -2435,7 +2494,7 @@
     <w:p>
       <w:r>
         <w:pict w14:anchorId="347CB9DD">
-          <v:rect id="_x0000_i1170" style="width:0;height:1.5pt" o:hralign="center" o:hrstd="t" o:hr="t" fillcolor="#a0a0a0" stroked="f"/>
+          <v:rect id="_x0000_i1031" style="width:0;height:1.5pt" o:hralign="center" o:hrstd="t" o:hr="t" fillcolor="#a0a0a0" stroked="f"/>
         </w:pict>
       </w:r>
     </w:p>
@@ -2482,7 +2541,7 @@
           <w:highlight w:val="yellow"/>
         </w:rPr>
         <w:pict w14:anchorId="0943A1E2">
-          <v:rect id="_x0000_i1171" style="width:0;height:1.5pt" o:hralign="center" o:hrstd="t" o:hr="t" fillcolor="#a0a0a0" stroked="f"/>
+          <v:rect id="_x0000_i1032" style="width:0;height:1.5pt" o:hralign="center" o:hrstd="t" o:hr="t" fillcolor="#a0a0a0" stroked="f"/>
         </w:pict>
       </w:r>
     </w:p>
@@ -2558,24 +2617,13 @@
         <w:spacing w:before="300" w:after="300"/>
       </w:pPr>
       <w:r>
-        <w:lastRenderedPageBreak/>
-        <w:t>“Hi [First Name], this is [Agent Name] with Alliance Mortgage Fund. We work with accredited investors who are looking for passive income through professionally managed real estate debt.”</w:t>
-      </w:r>
-    </w:p>
-    <w:p>
-      <w:pPr>
-        <w:spacing w:before="300" w:after="300"/>
-      </w:pPr>
-      <w:r>
-        <w:t>Pause.</w:t>
-      </w:r>
-    </w:p>
-    <w:p>
-      <w:pPr>
-        <w:spacing w:before="300" w:after="300"/>
-      </w:pPr>
-      <w:r>
-        <w:t>“The reason I’m calling is that many investors are looking for alternatives to traditional bonds or market-driven investments, especially options focused on income, diversification, and capital preservation.”</w:t>
+        <w:t xml:space="preserve">“Hi [First Name], this is </w:t>
+      </w:r>
+      <w:r>
+        <w:t>Jim</w:t>
+      </w:r>
+      <w:r>
+        <w:t xml:space="preserve"> with Alliance Mortgage Fund. We work with accredited investors who are looking for passive income through professionally managed real estate debt.”</w:t>
       </w:r>
     </w:p>
     <w:p>
@@ -2602,6 +2650,7 @@
           <w:sz w:val="26"/>
           <w:szCs w:val="26"/>
         </w:rPr>
+        <w:lastRenderedPageBreak/>
         <w:t>Discovery</w:t>
       </w:r>
     </w:p>
@@ -2610,7 +2659,13 @@
         <w:spacing w:before="300" w:after="300"/>
       </w:pPr>
       <w:r>
-        <w:t>“Are you currently exploring any real estate-backed or private credit investments?”</w:t>
+        <w:t xml:space="preserve">“Are you currently exploring any real estate-backed </w:t>
+      </w:r>
+      <w:r>
+        <w:t>mortgage funds or trust deed investments</w:t>
+      </w:r>
+      <w:r>
+        <w:t>?”</w:t>
       </w:r>
     </w:p>
     <w:p>
@@ -2626,7 +2681,19 @@
         <w:spacing w:before="300" w:after="300"/>
       </w:pPr>
       <w:r>
-        <w:t>“That makes sense. Are you mainly focused on monthly income, long-term growth, or a mix of both?”</w:t>
+        <w:t>“</w:t>
+      </w:r>
+      <w:r>
+        <w:t>Great</w:t>
+      </w:r>
+      <w:r>
+        <w:t xml:space="preserve">. Are you mainly focused on </w:t>
+      </w:r>
+      <w:r>
+        <w:t xml:space="preserve">mortgage REIT structures or one-off individual trust deed investments for </w:t>
+      </w:r>
+      <w:r>
+        <w:t>monthly income, long-term growth, or a mix of both?”</w:t>
       </w:r>
     </w:p>
     <w:p>
@@ -2657,7 +2724,7 @@
         </w:numPr>
       </w:pPr>
       <w:r>
-        <w:t>“Do you prefer passive investments, or do you actively manage real estate yourself?”</w:t>
+        <w:t>“Are you familiar with mortgage REIT structures?”</w:t>
       </w:r>
     </w:p>
     <w:p>
@@ -2666,32 +2733,16 @@
           <w:ilvl w:val="0"/>
           <w:numId w:val="17"/>
         </w:numPr>
-      </w:pPr>
-      <w:r>
-        <w:t>“Are you familiar with mortgage REIT structures?”</w:t>
-      </w:r>
-    </w:p>
-    <w:p>
-      <w:pPr>
-        <w:numPr>
-          <w:ilvl w:val="0"/>
-          <w:numId w:val="17"/>
-        </w:numPr>
-      </w:pPr>
-      <w:r>
-        <w:t>“Are you an accredited investor?”</w:t>
-      </w:r>
-    </w:p>
-    <w:p>
-      <w:pPr>
-        <w:numPr>
-          <w:ilvl w:val="0"/>
-          <w:numId w:val="17"/>
-        </w:numPr>
         <w:spacing w:after="300"/>
       </w:pPr>
       <w:r>
-        <w:t>“Is there a general investment range you typically consider for alternative investments?”</w:t>
+        <w:t>“</w:t>
+      </w:r>
+      <w:r>
+        <w:t>How much are you looking to invest or deploy</w:t>
+      </w:r>
+      <w:r>
+        <w:t>?”</w:t>
       </w:r>
     </w:p>
     <w:p>
@@ -2804,7 +2855,6 @@
         <w:spacing w:before="300" w:after="300"/>
       </w:pPr>
       <w:r>
-        <w:lastRenderedPageBreak/>
         <w:t xml:space="preserve">“The best next step would be a short overview call with the </w:t>
       </w:r>
       <w:r>
@@ -2886,8 +2936,9 @@
     </w:p>
     <w:p>
       <w:r>
+        <w:lastRenderedPageBreak/>
         <w:pict w14:anchorId="04C52EB3">
-          <v:rect id="_x0000_i1172" style="width:0;height:1.5pt" o:hralign="center" o:hrstd="t" o:hr="t" fillcolor="#a0a0a0" stroked="f"/>
+          <v:rect id="_x0000_i1033" style="width:0;height:1.5pt" o:hralign="center" o:hrstd="t" o:hr="t" fillcolor="#a0a0a0" stroked="f"/>
         </w:pict>
       </w:r>
     </w:p>
@@ -2963,23 +3014,144 @@
         <w:spacing w:before="300" w:after="300"/>
       </w:pPr>
       <w:r>
-        <w:t>“Hi [First Name], this is [Agent Name] with Alliance Mortgage Fund. We work with advisors who are looking for alternative income strategies for client portfolios.”</w:t>
-      </w:r>
-    </w:p>
-    <w:p>
-      <w:pPr>
-        <w:spacing w:before="300" w:after="300"/>
-      </w:pPr>
-      <w:r>
-        <w:t>Pause.</w:t>
-      </w:r>
-    </w:p>
-    <w:p>
-      <w:pPr>
-        <w:spacing w:before="300" w:after="300"/>
-      </w:pPr>
-      <w:r>
-        <w:t>“I’m reaching out because many RIAs are looking for ways to generate income outside traditional bonds, without adding unnecessary complexity, capital calls, or long private credit lockups.”</w:t>
+        <w:t xml:space="preserve">“Hi [First Name], this is </w:t>
+      </w:r>
+      <w:r>
+        <w:t xml:space="preserve">Jim </w:t>
+      </w:r>
+      <w:r>
+        <w:t>with Alliance Mortgage Fund. We work with advisors who are looking for alternative income strategies for client portfolios.”</w:t>
+      </w:r>
+    </w:p>
+    <w:p>
+      <w:pPr>
+        <w:spacing w:before="300" w:after="300"/>
+      </w:pPr>
+      <w:bookmarkStart w:id="26" w:name="_m3p7aw92iar7" w:colFirst="0" w:colLast="0"/>
+      <w:bookmarkEnd w:id="26"/>
+      <w:r>
+        <w:rPr>
+          <w:b/>
+          <w:bCs/>
+          <w:color w:val="000000"/>
+          <w:sz w:val="26"/>
+          <w:szCs w:val="26"/>
+        </w:rPr>
+        <w:t>Discovery</w:t>
+      </w:r>
+    </w:p>
+    <w:p>
+      <w:pPr>
+        <w:spacing w:before="300" w:after="300"/>
+      </w:pPr>
+      <w:r>
+        <w:t>Are you currently exploring any real estate-backed mortgage funds or trust deed investments</w:t>
+      </w:r>
+      <w:r>
+        <w:t xml:space="preserve"> for your clients”?</w:t>
+      </w:r>
+    </w:p>
+    <w:p>
+      <w:pPr>
+        <w:spacing w:before="300" w:after="300"/>
+      </w:pPr>
+      <w:r>
+        <w:t>If yes:</w:t>
+      </w:r>
+    </w:p>
+    <w:p>
+      <w:pPr>
+        <w:spacing w:before="300" w:after="300"/>
+      </w:pPr>
+      <w:r>
+        <w:t>“</w:t>
+      </w:r>
+      <w:r>
+        <w:t>Great</w:t>
+      </w:r>
+      <w:r>
+        <w:t xml:space="preserve">. </w:t>
+      </w:r>
+      <w:r>
+        <w:t>Are you mainly focused on mortgage REIT structures or one-off individual trust deed investments for monthly income, long-term growth, or a mix of both?”</w:t>
+      </w:r>
+    </w:p>
+    <w:p>
+      <w:pPr>
+        <w:spacing w:before="300" w:after="300"/>
+      </w:pPr>
+      <w:r>
+        <w:t>Additional questions:</w:t>
+      </w:r>
+    </w:p>
+    <w:p>
+      <w:pPr>
+        <w:numPr>
+          <w:ilvl w:val="0"/>
+          <w:numId w:val="15"/>
+        </w:numPr>
+        <w:spacing w:before="300"/>
+      </w:pPr>
+      <w:r>
+        <w:t xml:space="preserve">“Do your clients currently </w:t>
+      </w:r>
+      <w:r>
+        <w:t>invest in</w:t>
+      </w:r>
+      <w:r>
+        <w:t xml:space="preserve"> real estate debt funds</w:t>
+      </w:r>
+      <w:r>
+        <w:t xml:space="preserve"> or trust deed investments</w:t>
+      </w:r>
+      <w:r>
+        <w:t>?”</w:t>
+      </w:r>
+    </w:p>
+    <w:p>
+      <w:pPr>
+        <w:numPr>
+          <w:ilvl w:val="0"/>
+          <w:numId w:val="15"/>
+        </w:numPr>
+      </w:pPr>
+      <w:r>
+        <w:t>“Are monthly income strategies something your clients ask about?”</w:t>
+      </w:r>
+    </w:p>
+    <w:p>
+      <w:pPr>
+        <w:numPr>
+          <w:ilvl w:val="0"/>
+          <w:numId w:val="15"/>
+        </w:numPr>
+      </w:pPr>
+      <w:r>
+        <w:t xml:space="preserve">“Do you </w:t>
+      </w:r>
+      <w:r>
+        <w:t xml:space="preserve">work </w:t>
+      </w:r>
+      <w:r>
+        <w:t>through custodial platforms?”</w:t>
+      </w:r>
+    </w:p>
+    <w:p>
+      <w:pPr>
+        <w:numPr>
+          <w:ilvl w:val="0"/>
+          <w:numId w:val="15"/>
+        </w:numPr>
+        <w:spacing w:after="300"/>
+      </w:pPr>
+      <w:r>
+        <w:t xml:space="preserve">“What kind of due diligence materials do you require </w:t>
+      </w:r>
+      <w:r>
+        <w:t>when</w:t>
+      </w:r>
+      <w:r>
+        <w:t xml:space="preserve"> reviewing a fund?”</w:t>
       </w:r>
     </w:p>
     <w:p>
@@ -2996,8 +3168,8 @@
           <w:szCs w:val="26"/>
         </w:rPr>
       </w:pPr>
-      <w:bookmarkStart w:id="26" w:name="_m3p7aw92iar7" w:colFirst="0" w:colLast="0"/>
-      <w:bookmarkEnd w:id="26"/>
+      <w:bookmarkStart w:id="27" w:name="_rqgw0hka06v0" w:colFirst="0" w:colLast="0"/>
+      <w:bookmarkEnd w:id="27"/>
       <w:r>
         <w:rPr>
           <w:b/>
@@ -3006,86 +3178,23 @@
           <w:sz w:val="26"/>
           <w:szCs w:val="26"/>
         </w:rPr>
-        <w:t>Discovery</w:t>
-      </w:r>
-    </w:p>
-    <w:p>
-      <w:pPr>
-        <w:spacing w:before="300" w:after="300"/>
-      </w:pPr>
-      <w:r>
-        <w:t>“Are you currently evaluating private credit or real estate debt strategies for your clients?”</w:t>
-      </w:r>
-    </w:p>
-    <w:p>
-      <w:pPr>
-        <w:spacing w:before="300" w:after="300"/>
-      </w:pPr>
-      <w:r>
-        <w:t>If yes:</w:t>
-      </w:r>
-    </w:p>
-    <w:p>
-      <w:pPr>
-        <w:spacing w:before="300" w:after="300"/>
-      </w:pPr>
-      <w:r>
-        <w:t>“That makes sense. Are you mainly looking at these strategies for income, diversification, or reducing bond exposure?”</w:t>
-      </w:r>
-    </w:p>
-    <w:p>
-      <w:pPr>
-        <w:spacing w:before="300" w:after="300"/>
-      </w:pPr>
-      <w:r>
-        <w:t>Additional questions:</w:t>
-      </w:r>
-    </w:p>
-    <w:p>
-      <w:pPr>
-        <w:numPr>
-          <w:ilvl w:val="0"/>
-          <w:numId w:val="15"/>
-        </w:numPr>
-        <w:spacing w:before="300"/>
-      </w:pPr>
-      <w:r>
-        <w:t>“Do your clients currently use private credit or real estate debt funds?”</w:t>
-      </w:r>
-    </w:p>
-    <w:p>
-      <w:pPr>
-        <w:numPr>
-          <w:ilvl w:val="0"/>
-          <w:numId w:val="15"/>
-        </w:numPr>
-      </w:pPr>
-      <w:r>
-        <w:t>“Are monthly income strategies something your clients ask about?”</w:t>
-      </w:r>
-    </w:p>
-    <w:p>
-      <w:pPr>
-        <w:numPr>
-          <w:ilvl w:val="0"/>
-          <w:numId w:val="15"/>
-        </w:numPr>
-      </w:pPr>
-      <w:r>
-        <w:t>“Do you prefer strategies available through custodial platforms?”</w:t>
-      </w:r>
-    </w:p>
-    <w:p>
-      <w:pPr>
-        <w:numPr>
-          <w:ilvl w:val="0"/>
-          <w:numId w:val="15"/>
-        </w:numPr>
-        <w:spacing w:after="300"/>
-      </w:pPr>
-      <w:r>
-        <w:lastRenderedPageBreak/>
-        <w:t>“What kind of due diligence materials do you typically require before reviewing a fund?”</w:t>
+        <w:t>Value Statement</w:t>
+      </w:r>
+    </w:p>
+    <w:p>
+      <w:pPr>
+        <w:spacing w:before="300" w:after="300"/>
+      </w:pPr>
+      <w:r>
+        <w:t>“Alliance Mortgage Fund is a mortgage REIT strategy focused on real estate credit, not property ownership. The fund invests in carefully selected secured mortgage assets designed to generate income through interest spreads.”</w:t>
+      </w:r>
+    </w:p>
+    <w:p>
+      <w:pPr>
+        <w:spacing w:before="300" w:after="300"/>
+      </w:pPr>
+      <w:r>
+        <w:t>“For advisors, the key points are professional fund management, monthly distribution or reinvestment options, audited financials, no leverage at the fund level, and a structure designed to support advisor due diligence.”</w:t>
       </w:r>
     </w:p>
     <w:p>
@@ -3102,8 +3211,8 @@
           <w:szCs w:val="26"/>
         </w:rPr>
       </w:pPr>
-      <w:bookmarkStart w:id="27" w:name="_rqgw0hka06v0" w:colFirst="0" w:colLast="0"/>
-      <w:bookmarkEnd w:id="27"/>
+      <w:bookmarkStart w:id="28" w:name="_65toljonxnsw" w:colFirst="0" w:colLast="0"/>
+      <w:bookmarkEnd w:id="28"/>
       <w:r>
         <w:rPr>
           <w:b/>
@@ -3112,23 +3221,15 @@
           <w:sz w:val="26"/>
           <w:szCs w:val="26"/>
         </w:rPr>
-        <w:t>Value Statement</w:t>
-      </w:r>
-    </w:p>
-    <w:p>
-      <w:pPr>
-        <w:spacing w:before="300" w:after="300"/>
-      </w:pPr>
-      <w:r>
-        <w:t>“Alliance Mortgage Fund is a mortgage REIT strategy focused on real estate credit, not property ownership. The fund invests in carefully selected secured mortgage assets designed to generate income through interest spreads.”</w:t>
-      </w:r>
-    </w:p>
-    <w:p>
-      <w:pPr>
-        <w:spacing w:before="300" w:after="300"/>
-      </w:pPr>
-      <w:r>
-        <w:t>“For advisors, the key points are professional fund management, monthly distribution or reinvestment options, audited financials, no leverage at the fund level, and a structure designed to support advisor due diligence.”</w:t>
+        <w:t>Compliance-Safe Statement</w:t>
+      </w:r>
+    </w:p>
+    <w:p>
+      <w:pPr>
+        <w:spacing w:before="300" w:after="300"/>
+      </w:pPr>
+      <w:r>
+        <w:t>“Of course, suitability and portfolio fit are important. The goal would simply be to introduce the strategy and provide materials for review.”</w:t>
       </w:r>
     </w:p>
     <w:p>
@@ -3145,8 +3246,8 @@
           <w:szCs w:val="26"/>
         </w:rPr>
       </w:pPr>
-      <w:bookmarkStart w:id="28" w:name="_65toljonxnsw" w:colFirst="0" w:colLast="0"/>
-      <w:bookmarkEnd w:id="28"/>
+      <w:bookmarkStart w:id="29" w:name="_e9pzqz5upa3g" w:colFirst="0" w:colLast="0"/>
+      <w:bookmarkEnd w:id="29"/>
       <w:r>
         <w:rPr>
           <w:b/>
@@ -3155,41 +3256,6 @@
           <w:sz w:val="26"/>
           <w:szCs w:val="26"/>
         </w:rPr>
-        <w:t>Compliance-Safe Statement</w:t>
-      </w:r>
-    </w:p>
-    <w:p>
-      <w:pPr>
-        <w:spacing w:before="300" w:after="300"/>
-      </w:pPr>
-      <w:r>
-        <w:t>“Of course, suitability and portfolio fit are important. The goal would simply be to introduce the strategy and provide materials for review.”</w:t>
-      </w:r>
-    </w:p>
-    <w:p>
-      <w:pPr>
-        <w:pStyle w:val="Heading3"/>
-        <w:keepNext w:val="0"/>
-        <w:keepLines w:val="0"/>
-        <w:spacing w:before="280"/>
-        <w:rPr>
-          <w:b/>
-          <w:bCs/>
-          <w:color w:val="000000"/>
-          <w:sz w:val="26"/>
-          <w:szCs w:val="26"/>
-        </w:rPr>
-      </w:pPr>
-      <w:bookmarkStart w:id="29" w:name="_e9pzqz5upa3g" w:colFirst="0" w:colLast="0"/>
-      <w:bookmarkEnd w:id="29"/>
-      <w:r>
-        <w:rPr>
-          <w:b/>
-          <w:bCs/>
-          <w:color w:val="000000"/>
-          <w:sz w:val="26"/>
-          <w:szCs w:val="26"/>
-        </w:rPr>
         <w:t>Close</w:t>
       </w:r>
     </w:p>
@@ -3198,6 +3264,7 @@
         <w:spacing w:before="300" w:after="300"/>
       </w:pPr>
       <w:r>
+        <w:lastRenderedPageBreak/>
         <w:t xml:space="preserve">“I can set up a short introductory call with the </w:t>
       </w:r>
       <w:r>
@@ -3210,7 +3277,7 @@
     <w:p>
       <w:r>
         <w:pict w14:anchorId="4BC7CFEC">
-          <v:rect id="_x0000_i1173" style="width:0;height:1.5pt" o:hralign="center" o:hrstd="t" o:hr="t" fillcolor="#a0a0a0" stroked="f"/>
+          <v:rect id="_x0000_i1034" style="width:0;height:1.5pt" o:hralign="center" o:hrstd="t" o:hr="t" fillcolor="#a0a0a0" stroked="f"/>
         </w:pict>
       </w:r>
     </w:p>
@@ -3330,7 +3397,6 @@
         <w:spacing w:before="300" w:after="300"/>
       </w:pPr>
       <w:r>
-        <w:lastRenderedPageBreak/>
         <w:t>“Alliance Portfolio is a boutique private money lender specializing in unique California real estate lending scenarios that may not fit traditional bank guidelines.”</w:t>
       </w:r>
     </w:p>
@@ -3373,7 +3439,7 @@
     <w:p>
       <w:r>
         <w:pict w14:anchorId="76059ECB">
-          <v:rect id="_x0000_i1174" style="width:0;height:1.5pt" o:hralign="center" o:hrstd="t" o:hr="t" fillcolor="#a0a0a0" stroked="f"/>
+          <v:rect id="_x0000_i1035" style="width:0;height:1.5pt" o:hralign="center" o:hrstd="t" o:hr="t" fillcolor="#a0a0a0" stroked="f"/>
         </w:pict>
       </w:r>
     </w:p>
@@ -3444,6 +3510,7 @@
         <w:spacing w:before="300"/>
       </w:pPr>
       <w:r>
+        <w:lastRenderedPageBreak/>
         <w:t>1st position hard money loans</w:t>
       </w:r>
     </w:p>
@@ -3653,192 +3720,192 @@
           <w:sz w:val="34"/>
           <w:szCs w:val="34"/>
         </w:rPr>
+        <w:t>Loan Process</w:t>
+      </w:r>
+    </w:p>
+    <w:p>
+      <w:pPr>
+        <w:spacing w:before="300" w:after="300"/>
+      </w:pPr>
+      <w:r>
+        <w:t>The AI should understand this sequence:</w:t>
+      </w:r>
+    </w:p>
+    <w:p>
+      <w:pPr>
+        <w:numPr>
+          <w:ilvl w:val="0"/>
+          <w:numId w:val="3"/>
+        </w:numPr>
+        <w:spacing w:before="300"/>
+      </w:pPr>
+      <w:r>
+        <w:t>Submit loan scenario</w:t>
+      </w:r>
+    </w:p>
+    <w:p>
+      <w:pPr>
+        <w:numPr>
+          <w:ilvl w:val="0"/>
+          <w:numId w:val="3"/>
+        </w:numPr>
+      </w:pPr>
+      <w:r>
+        <w:t>Review basic details</w:t>
+      </w:r>
+    </w:p>
+    <w:p>
+      <w:pPr>
+        <w:numPr>
+          <w:ilvl w:val="0"/>
+          <w:numId w:val="3"/>
+        </w:numPr>
+      </w:pPr>
+      <w:r>
+        <w:t>Conditional approval and pricing</w:t>
+      </w:r>
+    </w:p>
+    <w:p>
+      <w:pPr>
+        <w:numPr>
+          <w:ilvl w:val="0"/>
+          <w:numId w:val="3"/>
+        </w:numPr>
+      </w:pPr>
+      <w:r>
+        <w:t>Letter of Intent</w:t>
+      </w:r>
+    </w:p>
+    <w:p>
+      <w:pPr>
+        <w:numPr>
+          <w:ilvl w:val="0"/>
+          <w:numId w:val="3"/>
+        </w:numPr>
+      </w:pPr>
+      <w:r>
+        <w:t>Borrower interview / review</w:t>
+      </w:r>
+    </w:p>
+    <w:p>
+      <w:pPr>
+        <w:numPr>
+          <w:ilvl w:val="0"/>
+          <w:numId w:val="3"/>
+        </w:numPr>
+      </w:pPr>
+      <w:r>
+        <w:t>Appraisal</w:t>
+      </w:r>
+    </w:p>
+    <w:p>
+      <w:pPr>
+        <w:numPr>
+          <w:ilvl w:val="0"/>
+          <w:numId w:val="3"/>
+        </w:numPr>
+      </w:pPr>
+      <w:r>
+        <w:t>Processing and underwriting</w:t>
+      </w:r>
+    </w:p>
+    <w:p>
+      <w:pPr>
+        <w:numPr>
+          <w:ilvl w:val="0"/>
+          <w:numId w:val="3"/>
+        </w:numPr>
+      </w:pPr>
+      <w:r>
+        <w:t>Loan documents</w:t>
+      </w:r>
+    </w:p>
+    <w:p>
+      <w:pPr>
+        <w:numPr>
+          <w:ilvl w:val="0"/>
+          <w:numId w:val="3"/>
+        </w:numPr>
+        <w:spacing w:after="300"/>
+      </w:pPr>
+      <w:r>
+        <w:t>Funding and closing</w:t>
+      </w:r>
+    </w:p>
+    <w:p>
+      <w:pPr>
+        <w:spacing w:before="300" w:after="300"/>
+      </w:pPr>
+      <w:r>
+        <w:t>The loan scenario intake should collect:</w:t>
+      </w:r>
+    </w:p>
+    <w:p>
+      <w:pPr>
+        <w:numPr>
+          <w:ilvl w:val="0"/>
+          <w:numId w:val="21"/>
+        </w:numPr>
+        <w:spacing w:before="300"/>
+      </w:pPr>
+      <w:r>
+        <w:t>Property location</w:t>
+      </w:r>
+    </w:p>
+    <w:p>
+      <w:pPr>
+        <w:numPr>
+          <w:ilvl w:val="0"/>
+          <w:numId w:val="21"/>
+        </w:numPr>
+      </w:pPr>
+      <w:r>
+        <w:t>Estimated property value</w:t>
+      </w:r>
+    </w:p>
+    <w:p>
+      <w:pPr>
+        <w:numPr>
+          <w:ilvl w:val="0"/>
+          <w:numId w:val="21"/>
+        </w:numPr>
+      </w:pPr>
+      <w:r>
+        <w:t>Current debt / what is owed</w:t>
+      </w:r>
+    </w:p>
+    <w:p>
+      <w:pPr>
+        <w:numPr>
+          <w:ilvl w:val="0"/>
+          <w:numId w:val="21"/>
+        </w:numPr>
+      </w:pPr>
+      <w:r>
+        <w:t>Desired loan amount</w:t>
+      </w:r>
+    </w:p>
+    <w:p>
+      <w:pPr>
+        <w:numPr>
+          <w:ilvl w:val="0"/>
+          <w:numId w:val="21"/>
+        </w:numPr>
+      </w:pPr>
+      <w:r>
+        <w:t>Use of funds</w:t>
+      </w:r>
+    </w:p>
+    <w:p>
+      <w:pPr>
+        <w:numPr>
+          <w:ilvl w:val="0"/>
+          <w:numId w:val="21"/>
+        </w:numPr>
+        <w:spacing w:after="300"/>
+      </w:pPr>
+      <w:r>
         <w:lastRenderedPageBreak/>
-        <w:t>Loan Process</w:t>
-      </w:r>
-    </w:p>
-    <w:p>
-      <w:pPr>
-        <w:spacing w:before="300" w:after="300"/>
-      </w:pPr>
-      <w:r>
-        <w:t>The AI should understand this sequence:</w:t>
-      </w:r>
-    </w:p>
-    <w:p>
-      <w:pPr>
-        <w:numPr>
-          <w:ilvl w:val="0"/>
-          <w:numId w:val="3"/>
-        </w:numPr>
-        <w:spacing w:before="300"/>
-      </w:pPr>
-      <w:r>
-        <w:t>Submit loan scenario</w:t>
-      </w:r>
-    </w:p>
-    <w:p>
-      <w:pPr>
-        <w:numPr>
-          <w:ilvl w:val="0"/>
-          <w:numId w:val="3"/>
-        </w:numPr>
-      </w:pPr>
-      <w:r>
-        <w:t>Review basic details</w:t>
-      </w:r>
-    </w:p>
-    <w:p>
-      <w:pPr>
-        <w:numPr>
-          <w:ilvl w:val="0"/>
-          <w:numId w:val="3"/>
-        </w:numPr>
-      </w:pPr>
-      <w:r>
-        <w:t>Conditional approval and pricing</w:t>
-      </w:r>
-    </w:p>
-    <w:p>
-      <w:pPr>
-        <w:numPr>
-          <w:ilvl w:val="0"/>
-          <w:numId w:val="3"/>
-        </w:numPr>
-      </w:pPr>
-      <w:r>
-        <w:t>Letter of Intent</w:t>
-      </w:r>
-    </w:p>
-    <w:p>
-      <w:pPr>
-        <w:numPr>
-          <w:ilvl w:val="0"/>
-          <w:numId w:val="3"/>
-        </w:numPr>
-      </w:pPr>
-      <w:r>
-        <w:t>Borrower interview / review</w:t>
-      </w:r>
-    </w:p>
-    <w:p>
-      <w:pPr>
-        <w:numPr>
-          <w:ilvl w:val="0"/>
-          <w:numId w:val="3"/>
-        </w:numPr>
-      </w:pPr>
-      <w:r>
-        <w:t>Appraisal</w:t>
-      </w:r>
-    </w:p>
-    <w:p>
-      <w:pPr>
-        <w:numPr>
-          <w:ilvl w:val="0"/>
-          <w:numId w:val="3"/>
-        </w:numPr>
-      </w:pPr>
-      <w:r>
-        <w:t>Processing and underwriting</w:t>
-      </w:r>
-    </w:p>
-    <w:p>
-      <w:pPr>
-        <w:numPr>
-          <w:ilvl w:val="0"/>
-          <w:numId w:val="3"/>
-        </w:numPr>
-      </w:pPr>
-      <w:r>
-        <w:t>Loan documents</w:t>
-      </w:r>
-    </w:p>
-    <w:p>
-      <w:pPr>
-        <w:numPr>
-          <w:ilvl w:val="0"/>
-          <w:numId w:val="3"/>
-        </w:numPr>
-        <w:spacing w:after="300"/>
-      </w:pPr>
-      <w:r>
-        <w:t>Funding and closing</w:t>
-      </w:r>
-    </w:p>
-    <w:p>
-      <w:pPr>
-        <w:spacing w:before="300" w:after="300"/>
-      </w:pPr>
-      <w:r>
-        <w:t>The loan scenario intake should collect:</w:t>
-      </w:r>
-    </w:p>
-    <w:p>
-      <w:pPr>
-        <w:numPr>
-          <w:ilvl w:val="0"/>
-          <w:numId w:val="21"/>
-        </w:numPr>
-        <w:spacing w:before="300"/>
-      </w:pPr>
-      <w:r>
-        <w:t>Property location</w:t>
-      </w:r>
-    </w:p>
-    <w:p>
-      <w:pPr>
-        <w:numPr>
-          <w:ilvl w:val="0"/>
-          <w:numId w:val="21"/>
-        </w:numPr>
-      </w:pPr>
-      <w:r>
-        <w:t>Estimated property value</w:t>
-      </w:r>
-    </w:p>
-    <w:p>
-      <w:pPr>
-        <w:numPr>
-          <w:ilvl w:val="0"/>
-          <w:numId w:val="21"/>
-        </w:numPr>
-      </w:pPr>
-      <w:r>
-        <w:t>Current debt / what is owed</w:t>
-      </w:r>
-    </w:p>
-    <w:p>
-      <w:pPr>
-        <w:numPr>
-          <w:ilvl w:val="0"/>
-          <w:numId w:val="21"/>
-        </w:numPr>
-      </w:pPr>
-      <w:r>
-        <w:t>Desired loan amount</w:t>
-      </w:r>
-    </w:p>
-    <w:p>
-      <w:pPr>
-        <w:numPr>
-          <w:ilvl w:val="0"/>
-          <w:numId w:val="21"/>
-        </w:numPr>
-      </w:pPr>
-      <w:r>
-        <w:t>Use of funds</w:t>
-      </w:r>
-    </w:p>
-    <w:p>
-      <w:pPr>
-        <w:numPr>
-          <w:ilvl w:val="0"/>
-          <w:numId w:val="21"/>
-        </w:numPr>
-        <w:spacing w:after="300"/>
-      </w:pPr>
-      <w:r>
         <w:t>Timeline to close</w:t>
       </w:r>
     </w:p>
@@ -3859,7 +3926,7 @@
     <w:p>
       <w:r>
         <w:pict w14:anchorId="5414F32A">
-          <v:rect id="_x0000_i1175" style="width:0;height:1.5pt" o:hralign="center" o:hrstd="t" o:hr="t" fillcolor="#a0a0a0" stroked="f"/>
+          <v:rect id="_x0000_i1036" style="width:0;height:1.5pt" o:hralign="center" o:hrstd="t" o:hr="t" fillcolor="#a0a0a0" stroked="f"/>
         </w:pict>
       </w:r>
     </w:p>
@@ -4060,7 +4127,6 @@
         <w:spacing w:before="300" w:after="300"/>
       </w:pPr>
       <w:r>
-        <w:lastRenderedPageBreak/>
         <w:t>The AI should explain:</w:t>
       </w:r>
     </w:p>
@@ -4099,7 +4165,7 @@
     <w:p>
       <w:r>
         <w:pict w14:anchorId="22D5E369">
-          <v:rect id="_x0000_i1176" style="width:0;height:1.5pt" o:hralign="center" o:hrstd="t" o:hr="t" fillcolor="#a0a0a0" stroked="f"/>
+          <v:rect id="_x0000_i1037" style="width:0;height:1.5pt" o:hralign="center" o:hrstd="t" o:hr="t" fillcolor="#a0a0a0" stroked="f"/>
         </w:pict>
       </w:r>
     </w:p>
@@ -4162,6 +4228,7 @@
           <w:b/>
           <w:bCs/>
         </w:rPr>
+        <w:lastRenderedPageBreak/>
         <w:t>Q: What is Alliance Portfolio?</w:t>
       </w:r>
       <w:r>
@@ -4290,7 +4357,7 @@
     <w:p>
       <w:r>
         <w:pict w14:anchorId="7D2E5044">
-          <v:rect id="_x0000_i1147" style="width:0;height:1.5pt" o:hralign="center" o:hrstd="t" o:hr="t" fillcolor="#a0a0a0" stroked="f"/>
+          <v:rect id="_x0000_i1038" style="width:0;height:1.5pt" o:hralign="center" o:hrstd="t" o:hr="t" fillcolor="#a0a0a0" stroked="f"/>
         </w:pict>
       </w:r>
     </w:p>
@@ -4386,23 +4453,148 @@
         <w:t>Alliance Portfolio</w:t>
       </w:r>
       <w:r>
-        <w:t xml:space="preserve"> </w:t>
-      </w:r>
-      <w:r>
+        <w:t xml:space="preserve"> primarily focuses on business-purpose real estate lending. The team can review the scenario and confirm what may be possible.”</w:t>
+      </w:r>
+    </w:p>
+    <w:p>
+      <w:pPr>
+        <w:spacing w:before="300" w:after="300"/>
+      </w:pPr>
+      <w:r>
+        <w:rPr>
+          <w:b/>
+          <w:bCs/>
+        </w:rPr>
+        <w:t xml:space="preserve">Q: What loan-to-value does </w:t>
+      </w:r>
+      <w:r>
+        <w:rPr>
+          <w:b/>
+          <w:bCs/>
+        </w:rPr>
+        <w:t>Alliance Portfolio</w:t>
+      </w:r>
+      <w:r>
+        <w:rPr>
+          <w:b/>
+          <w:bCs/>
+        </w:rPr>
+        <w:t xml:space="preserve"> offer?</w:t>
+      </w:r>
+      <w:r>
+        <w:rPr>
+          <w:b/>
+          <w:bCs/>
+        </w:rPr>
+        <w:br/>
+      </w:r>
+      <w:r>
+        <w:t xml:space="preserve"> A: Uploaded materials reference 1st and 2nd hard money mortgages up to approximately 65% LTV. The AI should avoid guaranteeing terms and say the final structure depends on the scenario.</w:t>
+      </w:r>
+    </w:p>
+    <w:p>
+      <w:pPr>
+        <w:spacing w:before="300" w:after="300"/>
+      </w:pPr>
+      <w:r>
+        <w:rPr>
+          <w:b/>
+          <w:bCs/>
+        </w:rPr>
+        <w:t xml:space="preserve">Q: How fast can </w:t>
+      </w:r>
+      <w:r>
+        <w:rPr>
+          <w:b/>
+          <w:bCs/>
+        </w:rPr>
+        <w:t>Alliance Portfolio</w:t>
+      </w:r>
+      <w:r>
+        <w:rPr>
+          <w:b/>
+          <w:bCs/>
+        </w:rPr>
+        <w:t xml:space="preserve"> close?</w:t>
+      </w:r>
+      <w:r>
+        <w:rPr>
+          <w:b/>
+          <w:bCs/>
+        </w:rPr>
+        <w:br/>
+      </w:r>
+      <w:r>
+        <w:t xml:space="preserve"> A: Timelines depend on the deal, appraisal, documentation, and underwriting, but </w:t>
+      </w:r>
+      <w:r>
+        <w:t>Alliance Portfolio</w:t>
+      </w:r>
+      <w:r>
+        <w:t xml:space="preserve"> is structured for speed and efficient execution.</w:t>
+      </w:r>
+    </w:p>
+    <w:p>
+      <w:pPr>
+        <w:spacing w:before="300" w:after="300"/>
+      </w:pPr>
+      <w:r>
+        <w:rPr>
+          <w:b/>
+          <w:bCs/>
+        </w:rPr>
+        <w:t>Q: What information is needed to review a loan scenario?</w:t>
+      </w:r>
+      <w:r>
+        <w:rPr>
+          <w:b/>
+          <w:bCs/>
+        </w:rPr>
+        <w:br/>
+      </w:r>
+      <w:r>
+        <w:t xml:space="preserve"> A: Property location, property value, current debt, desired loan amount, use of funds, property type, borrower profile, and closing timeline.</w:t>
+      </w:r>
+    </w:p>
+    <w:p>
+      <w:pPr>
+        <w:spacing w:before="300" w:after="300"/>
+      </w:pPr>
+      <w:r>
+        <w:rPr>
+          <w:b/>
+          <w:bCs/>
+        </w:rPr>
+        <w:t>Q: What if a bank already declined the borrower?</w:t>
+      </w:r>
+      <w:r>
+        <w:rPr>
+          <w:b/>
+          <w:bCs/>
+        </w:rPr>
+        <w:br/>
+      </w:r>
+      <w:r>
+        <w:t xml:space="preserve"> A: That is often where </w:t>
+      </w:r>
+      <w:r>
+        <w:t>Alliance Portfolio</w:t>
+      </w:r>
+      <w:r>
+        <w:t xml:space="preserve"> may be able to help, depending on the property, equity, use of funds, and overall scenario.</w:t>
+      </w:r>
+    </w:p>
+    <w:p>
+      <w:pPr>
+        <w:spacing w:before="300" w:after="300"/>
+      </w:pPr>
+      <w:r>
+        <w:rPr>
+          <w:b/>
+          <w:bCs/>
+        </w:rPr>
         <w:lastRenderedPageBreak/>
-        <w:t>primarily focuses on business-purpose real estate lending. The team can review the scenario and confirm what may be possible.”</w:t>
-      </w:r>
-    </w:p>
-    <w:p>
-      <w:pPr>
-        <w:spacing w:before="300" w:after="300"/>
-      </w:pPr>
-      <w:r>
-        <w:rPr>
-          <w:b/>
-          <w:bCs/>
-        </w:rPr>
-        <w:t xml:space="preserve">Q: What loan-to-value does </w:t>
+        <w:t xml:space="preserve">Q: Does </w:t>
       </w:r>
       <w:r>
         <w:rPr>
@@ -4416,7 +4608,7 @@
           <w:b/>
           <w:bCs/>
         </w:rPr>
-        <w:t xml:space="preserve"> offer?</w:t>
+        <w:t xml:space="preserve"> work with brokers?</w:t>
       </w:r>
       <w:r>
         <w:rPr>
@@ -4426,33 +4618,39 @@
         <w:br/>
       </w:r>
       <w:r>
-        <w:t xml:space="preserve"> A: Uploaded materials reference 1st and 2nd hard money mortgages up to approximately 65% LTV. The AI should avoid guaranteeing terms and say the final structure depends on the scenario.</w:t>
-      </w:r>
-    </w:p>
-    <w:p>
-      <w:pPr>
-        <w:spacing w:before="300" w:after="300"/>
-      </w:pPr>
-      <w:r>
-        <w:rPr>
-          <w:b/>
-          <w:bCs/>
-        </w:rPr>
-        <w:t xml:space="preserve">Q: How fast can </w:t>
-      </w:r>
-      <w:r>
-        <w:rPr>
-          <w:b/>
-          <w:bCs/>
-        </w:rPr>
+        <w:t xml:space="preserve"> A: Yes. </w:t>
+      </w:r>
+      <w:r>
         <w:t>Alliance Portfolio</w:t>
       </w:r>
       <w:r>
-        <w:rPr>
-          <w:b/>
-          <w:bCs/>
-        </w:rPr>
-        <w:t xml:space="preserve"> close?</w:t>
+        <w:t xml:space="preserve"> works with brokers and can be a resource for hard-to-place or time-sensitive private money scenarios.</w:t>
+      </w:r>
+    </w:p>
+    <w:p>
+      <w:pPr>
+        <w:spacing w:before="300" w:after="300"/>
+      </w:pPr>
+      <w:r>
+        <w:rPr>
+          <w:b/>
+          <w:bCs/>
+        </w:rPr>
+        <w:t xml:space="preserve">Q: What types of properties does </w:t>
+      </w:r>
+      <w:r>
+        <w:rPr>
+          <w:b/>
+          <w:bCs/>
+        </w:rPr>
+        <w:t>Alliance Portfolio</w:t>
+      </w:r>
+      <w:r>
+        <w:rPr>
+          <w:b/>
+          <w:bCs/>
+        </w:rPr>
+        <w:t xml:space="preserve"> consider?</w:t>
       </w:r>
       <w:r>
         <w:rPr>
@@ -4462,147 +4660,13 @@
         <w:br/>
       </w:r>
       <w:r>
-        <w:t xml:space="preserve"> A: Timelines depend on the deal, appraisal, documentation, and underwriting, but </w:t>
-      </w:r>
-      <w:r>
-        <w:t>Alliance Portfolio</w:t>
-      </w:r>
-      <w:r>
-        <w:t xml:space="preserve"> is structured for speed and efficient execution.</w:t>
-      </w:r>
-    </w:p>
-    <w:p>
-      <w:pPr>
-        <w:spacing w:before="300" w:after="300"/>
-      </w:pPr>
-      <w:r>
-        <w:rPr>
-          <w:b/>
-          <w:bCs/>
-        </w:rPr>
-        <w:t>Q: What information is needed to review a loan scenario?</w:t>
-      </w:r>
-      <w:r>
-        <w:rPr>
-          <w:b/>
-          <w:bCs/>
-        </w:rPr>
-        <w:br/>
-      </w:r>
-      <w:r>
-        <w:t xml:space="preserve"> A: Property location, property value, current debt, desired loan amount, use of funds, property type, borrower profile, and closing timeline.</w:t>
-      </w:r>
-    </w:p>
-    <w:p>
-      <w:pPr>
-        <w:spacing w:before="300" w:after="300"/>
-      </w:pPr>
-      <w:r>
-        <w:rPr>
-          <w:b/>
-          <w:bCs/>
-        </w:rPr>
-        <w:t>Q: What if a bank already declined the borrower?</w:t>
-      </w:r>
-      <w:r>
-        <w:rPr>
-          <w:b/>
-          <w:bCs/>
-        </w:rPr>
-        <w:br/>
-      </w:r>
-      <w:r>
-        <w:t xml:space="preserve"> A: That is often where </w:t>
-      </w:r>
-      <w:r>
-        <w:t>Alliance Portfolio</w:t>
-      </w:r>
-      <w:r>
-        <w:t xml:space="preserve"> may be able to help, depending on the property, equity, use of funds, and overall scenario.</w:t>
-      </w:r>
-    </w:p>
-    <w:p>
-      <w:pPr>
-        <w:spacing w:before="300" w:after="300"/>
-      </w:pPr>
-      <w:r>
-        <w:rPr>
-          <w:b/>
-          <w:bCs/>
-        </w:rPr>
-        <w:t xml:space="preserve">Q: Does </w:t>
-      </w:r>
-      <w:r>
-        <w:rPr>
-          <w:b/>
-          <w:bCs/>
-        </w:rPr>
-        <w:t>Alliance Portfolio</w:t>
-      </w:r>
-      <w:r>
-        <w:rPr>
-          <w:b/>
-          <w:bCs/>
-        </w:rPr>
-        <w:t xml:space="preserve"> work with brokers?</w:t>
-      </w:r>
-      <w:r>
-        <w:rPr>
-          <w:b/>
-          <w:bCs/>
-        </w:rPr>
-        <w:br/>
-      </w:r>
-      <w:r>
-        <w:t xml:space="preserve"> A: Yes. </w:t>
-      </w:r>
-      <w:r>
-        <w:t>Alliance Portfolio</w:t>
-      </w:r>
-      <w:r>
-        <w:t xml:space="preserve"> works with brokers and can be a resource for hard-to-place or time-sensitive private money scenarios.</w:t>
-      </w:r>
-    </w:p>
-    <w:p>
-      <w:pPr>
-        <w:spacing w:before="300" w:after="300"/>
-      </w:pPr>
-      <w:r>
-        <w:rPr>
-          <w:b/>
-          <w:bCs/>
-        </w:rPr>
-        <w:t xml:space="preserve">Q: What types of properties does </w:t>
-      </w:r>
-      <w:r>
-        <w:rPr>
-          <w:b/>
-          <w:bCs/>
-        </w:rPr>
-        <w:t>Alliance Portfolio</w:t>
-      </w:r>
-      <w:r>
-        <w:rPr>
-          <w:b/>
-          <w:bCs/>
-        </w:rPr>
-        <w:t xml:space="preserve"> consider?</w:t>
-      </w:r>
-      <w:r>
-        <w:rPr>
-          <w:b/>
-          <w:bCs/>
-        </w:rPr>
-        <w:br/>
-      </w:r>
-      <w:r>
         <w:t xml:space="preserve"> A: Income-producing residential, multifamily, mixed-use, commercial, and investment-related properties may be considered depending on the scenario.</w:t>
       </w:r>
     </w:p>
     <w:p>
       <w:r>
         <w:pict w14:anchorId="6F004182">
-          <v:rect id="_x0000_i1148" style="width:0;height:1.5pt" o:hralign="center" o:hrstd="t" o:hr="t" fillcolor="#a0a0a0" stroked="f"/>
+          <v:rect id="_x0000_i1039" style="width:0;height:1.5pt" o:hralign="center" o:hrstd="t" o:hr="t" fillcolor="#a0a0a0" stroked="f"/>
         </w:pict>
       </w:r>
     </w:p>
@@ -4712,8 +4776,146 @@
           <w:b/>
           <w:bCs/>
         </w:rPr>
+        <w:t>Q: How do investors receive income?</w:t>
+      </w:r>
+      <w:r>
+        <w:rPr>
+          <w:b/>
+          <w:bCs/>
+        </w:rPr>
+        <w:br/>
+      </w:r>
+      <w:r>
+        <w:t xml:space="preserve"> A: Investors may have the option of monthly cash distributions or reinvestment, depending on the fund terms and investor preference.</w:t>
+      </w:r>
+    </w:p>
+    <w:p>
+      <w:pPr>
+        <w:spacing w:before="300" w:after="300"/>
+      </w:pPr>
+      <w:r>
+        <w:rPr>
+          <w:b/>
+          <w:bCs/>
+        </w:rPr>
+        <w:t>Q: Is the investment guaranteed?</w:t>
+      </w:r>
+      <w:r>
+        <w:rPr>
+          <w:b/>
+          <w:bCs/>
+        </w:rPr>
+        <w:br/>
+      </w:r>
+      <w:r>
+        <w:t xml:space="preserve"> A: No. The AI must never guarantee returns, income, safety, or performance. It should clearly state that all investments carry risk.</w:t>
+      </w:r>
+    </w:p>
+    <w:p>
+      <w:pPr>
+        <w:spacing w:before="300" w:after="300"/>
+      </w:pPr>
+      <w:r>
+        <w:rPr>
+          <w:b/>
+          <w:bCs/>
+        </w:rPr>
+        <w:t>Q: What are the risks?</w:t>
+      </w:r>
+      <w:r>
+        <w:rPr>
+          <w:b/>
+          <w:bCs/>
+        </w:rPr>
+        <w:br/>
+      </w:r>
+      <w:r>
+        <w:t xml:space="preserve"> A: Risks may include real estate market risk, credit risk, borrower default risk, liquidity risk, and other investment risks. Suitability should be reviewed with the </w:t>
+      </w:r>
+      <w:r>
+        <w:t>Alliance Portfolio</w:t>
+      </w:r>
+      <w:r>
+        <w:t xml:space="preserve"> team.</w:t>
+      </w:r>
+    </w:p>
+    <w:p>
+      <w:pPr>
+        <w:spacing w:before="300" w:after="300"/>
+      </w:pPr>
+      <w:r>
+        <w:rPr>
+          <w:b/>
+          <w:bCs/>
+        </w:rPr>
+        <w:t>Q: What makes the fund different from buying property directly?</w:t>
+      </w:r>
+      <w:r>
+        <w:rPr>
+          <w:b/>
+          <w:bCs/>
+        </w:rPr>
+        <w:br/>
+      </w:r>
+      <w:r>
+        <w:t xml:space="preserve"> A: The fund focuses on real estate credit, not property ownership. Investors participate passively in a professionally managed portfolio rather than managing properties themselves.</w:t>
+      </w:r>
+    </w:p>
+    <w:p>
+      <w:pPr>
+        <w:spacing w:before="300" w:after="300"/>
+      </w:pPr>
+      <w:r>
+        <w:rPr>
+          <w:b/>
+          <w:bCs/>
+        </w:rPr>
+        <w:t>Q: What makes the fund different from a single trust deed?</w:t>
+      </w:r>
+      <w:r>
+        <w:rPr>
+          <w:b/>
+          <w:bCs/>
+        </w:rPr>
+        <w:br/>
+      </w:r>
+      <w:r>
+        <w:t xml:space="preserve"> A: A single trust deed relies on one loan. Alliance Mortgage Fund is designed to provide diversification across a portfolio of mortgage assets.</w:t>
+      </w:r>
+    </w:p>
+    <w:p>
+      <w:pPr>
+        <w:spacing w:before="300" w:after="300"/>
+      </w:pPr>
+      <w:r>
+        <w:rPr>
+          <w:b/>
+          <w:bCs/>
+        </w:rPr>
+        <w:t>Q: Are financials audited?</w:t>
+      </w:r>
+      <w:r>
+        <w:rPr>
+          <w:b/>
+          <w:bCs/>
+        </w:rPr>
+        <w:br/>
+      </w:r>
+      <w:r>
+        <w:t xml:space="preserve"> A: Uploaded materials reference audited financials and reporting transparency.</w:t>
+      </w:r>
+    </w:p>
+    <w:p>
+      <w:pPr>
+        <w:spacing w:before="300" w:after="300"/>
+      </w:pPr>
+      <w:r>
+        <w:rPr>
+          <w:b/>
+          <w:bCs/>
+        </w:rPr>
         <w:lastRenderedPageBreak/>
-        <w:t>Q: How do investors receive income?</w:t>
+        <w:t>Q: Is the fund leveraged?</w:t>
       </w:r>
       <w:r>
         <w:rPr>
@@ -4723,151 +4925,13 @@
         <w:br/>
       </w:r>
       <w:r>
-        <w:t xml:space="preserve"> A: Investors may have the option of monthly cash distributions or reinvestment, depending on the fund terms and investor preference.</w:t>
-      </w:r>
-    </w:p>
-    <w:p>
-      <w:pPr>
-        <w:spacing w:before="300" w:after="300"/>
-      </w:pPr>
-      <w:r>
-        <w:rPr>
-          <w:b/>
-          <w:bCs/>
-        </w:rPr>
-        <w:t>Q: Is the investment guaranteed?</w:t>
-      </w:r>
-      <w:r>
-        <w:rPr>
-          <w:b/>
-          <w:bCs/>
-        </w:rPr>
-        <w:br/>
-      </w:r>
-      <w:r>
-        <w:t xml:space="preserve"> A: No. The AI must never guarantee returns, income, safety, or performance. It should clearly state that all investments carry risk.</w:t>
-      </w:r>
-    </w:p>
-    <w:p>
-      <w:pPr>
-        <w:spacing w:before="300" w:after="300"/>
-      </w:pPr>
-      <w:r>
-        <w:rPr>
-          <w:b/>
-          <w:bCs/>
-        </w:rPr>
-        <w:t>Q: What are the risks?</w:t>
-      </w:r>
-      <w:r>
-        <w:rPr>
-          <w:b/>
-          <w:bCs/>
-        </w:rPr>
-        <w:br/>
-      </w:r>
-      <w:r>
-        <w:t xml:space="preserve"> A: Risks may include real estate market risk, credit risk, borrower default risk, liquidity risk, and other investment risks. Suitability should be reviewed with the </w:t>
-      </w:r>
-      <w:r>
-        <w:t>Alliance Portfolio</w:t>
-      </w:r>
-      <w:r>
-        <w:t xml:space="preserve"> team.</w:t>
-      </w:r>
-    </w:p>
-    <w:p>
-      <w:pPr>
-        <w:spacing w:before="300" w:after="300"/>
-      </w:pPr>
-      <w:r>
-        <w:rPr>
-          <w:b/>
-          <w:bCs/>
-        </w:rPr>
-        <w:t>Q: What makes the fund different from buying property directly?</w:t>
-      </w:r>
-      <w:r>
-        <w:rPr>
-          <w:b/>
-          <w:bCs/>
-        </w:rPr>
-        <w:br/>
-      </w:r>
-      <w:r>
-        <w:t xml:space="preserve"> A: The fund focuses on real estate credit, not property ownership. Investors participate passively in a professionally managed portfolio rather than managing properties themselves.</w:t>
-      </w:r>
-    </w:p>
-    <w:p>
-      <w:pPr>
-        <w:spacing w:before="300" w:after="300"/>
-      </w:pPr>
-      <w:r>
-        <w:rPr>
-          <w:b/>
-          <w:bCs/>
-        </w:rPr>
-        <w:t>Q: What makes the fund different from a single trust deed?</w:t>
-      </w:r>
-      <w:r>
-        <w:rPr>
-          <w:b/>
-          <w:bCs/>
-        </w:rPr>
-        <w:br/>
-      </w:r>
-      <w:r>
-        <w:t xml:space="preserve"> A: A single trust deed relies on one loan. Alliance Mortgage Fund is designed to provide diversification across a portfolio of mortgage assets.</w:t>
-      </w:r>
-    </w:p>
-    <w:p>
-      <w:pPr>
-        <w:spacing w:before="300" w:after="300"/>
-      </w:pPr>
-      <w:r>
-        <w:rPr>
-          <w:b/>
-          <w:bCs/>
-        </w:rPr>
-        <w:t>Q: Are financials audited?</w:t>
-      </w:r>
-      <w:r>
-        <w:rPr>
-          <w:b/>
-          <w:bCs/>
-        </w:rPr>
-        <w:br/>
-      </w:r>
-      <w:r>
-        <w:t xml:space="preserve"> A: Uploaded materials reference audited financials and reporting transparency.</w:t>
-      </w:r>
-    </w:p>
-    <w:p>
-      <w:pPr>
-        <w:spacing w:before="300" w:after="300"/>
-      </w:pPr>
-      <w:r>
-        <w:rPr>
-          <w:b/>
-          <w:bCs/>
-        </w:rPr>
-        <w:t>Q: Is the fund leveraged?</w:t>
-      </w:r>
-      <w:r>
-        <w:rPr>
-          <w:b/>
-          <w:bCs/>
-        </w:rPr>
-        <w:br/>
-      </w:r>
-      <w:r>
         <w:t xml:space="preserve"> A: Uploaded RIA materials state no leverage at the fund level.</w:t>
       </w:r>
     </w:p>
     <w:p>
       <w:r>
         <w:pict w14:anchorId="55DD3CF7">
-          <v:rect id="_x0000_i1149" style="width:0;height:1.5pt" o:hralign="center" o:hrstd="t" o:hr="t" fillcolor="#a0a0a0" stroked="f"/>
+          <v:rect id="_x0000_i1040" style="width:0;height:1.5pt" o:hralign="center" o:hrstd="t" o:hr="t" fillcolor="#a0a0a0" stroked="f"/>
         </w:pict>
       </w:r>
     </w:p>
@@ -4994,7 +5058,6 @@
           <w:b/>
           <w:bCs/>
         </w:rPr>
-        <w:lastRenderedPageBreak/>
         <w:t>Objection: “How fast can you close?”</w:t>
       </w:r>
       <w:r>
@@ -5111,6 +5174,7 @@
           <w:b/>
           <w:bCs/>
         </w:rPr>
+        <w:lastRenderedPageBreak/>
         <w:t>Objection: “Not interested.”</w:t>
       </w:r>
       <w:r>
@@ -5137,7 +5201,7 @@
     <w:p>
       <w:r>
         <w:pict w14:anchorId="2AF43A42">
-          <v:rect id="_x0000_i1150" style="width:0;height:1.5pt" o:hralign="center" o:hrstd="t" o:hr="t" fillcolor="#a0a0a0" stroked="f"/>
+          <v:rect id="_x0000_i1041" style="width:0;height:1.5pt" o:hralign="center" o:hrstd="t" o:hr="t" fillcolor="#a0a0a0" stroked="f"/>
         </w:pict>
       </w:r>
     </w:p>
@@ -5241,11 +5305,7 @@
       </w:r>
       <w:r>
         <w:br/>
-        <w:t xml:space="preserve"> “That makes sense. This is different from owning property directly. Alliance Mortgage Fund </w:t>
-      </w:r>
-      <w:r>
-        <w:lastRenderedPageBreak/>
-        <w:t>is designed as passive real estate debt exposure, so investors are not managing tenants, repairs, or individual properties.”</w:t>
+        <w:t xml:space="preserve"> “That makes sense. This is different from owning property directly. Alliance Mortgage Fund is designed as passive real estate debt exposure, so investors are not managing tenants, repairs, or individual properties.”</w:t>
       </w:r>
     </w:p>
     <w:p>
@@ -5355,13 +5415,16 @@
       </w:r>
       <w:r>
         <w:br/>
+      </w:r>
+      <w:r>
+        <w:lastRenderedPageBreak/>
         <w:t xml:space="preserve"> “Of course. I can send a short overview. Are you reviewing this for yourself as an accredited investor, or are you an advisor reviewing it for clients?”</w:t>
       </w:r>
     </w:p>
     <w:p>
       <w:r>
         <w:pict w14:anchorId="337501B8">
-          <v:rect id="_x0000_i1151" style="width:0;height:1.5pt" o:hralign="center" o:hrstd="t" o:hr="t" fillcolor="#a0a0a0" stroked="f"/>
+          <v:rect id="_x0000_i1042" style="width:0;height:1.5pt" o:hralign="center" o:hrstd="t" o:hr="t" fillcolor="#a0a0a0" stroked="f"/>
         </w:pict>
       </w:r>
     </w:p>
@@ -5579,9 +5642,8 @@
     </w:p>
     <w:p>
       <w:r>
-        <w:lastRenderedPageBreak/>
         <w:pict w14:anchorId="1CABA0C6">
-          <v:rect id="_x0000_i1152" style="width:0;height:1.5pt" o:hralign="center" o:hrstd="t" o:hr="t" fillcolor="#a0a0a0" stroked="f"/>
+          <v:rect id="_x0000_i1043" style="width:0;height:1.5pt" o:hralign="center" o:hrstd="t" o:hr="t" fillcolor="#a0a0a0" stroked="f"/>
         </w:pict>
       </w:r>
     </w:p>
@@ -5669,7 +5731,7 @@
     <w:p>
       <w:r>
         <w:pict w14:anchorId="084F8859">
-          <v:rect id="_x0000_i1153" style="width:0;height:1.5pt" o:hralign="center" o:hrstd="t" o:hr="t" fillcolor="#a0a0a0" stroked="f"/>
+          <v:rect id="_x0000_i1044" style="width:0;height:1.5pt" o:hralign="center" o:hrstd="t" o:hr="t" fillcolor="#a0a0a0" stroked="f"/>
         </w:pict>
       </w:r>
     </w:p>
@@ -5750,8 +5812,9 @@
     </w:p>
     <w:p>
       <w:r>
+        <w:lastRenderedPageBreak/>
         <w:pict w14:anchorId="409898CF">
-          <v:rect id="_x0000_i1154" style="width:0;height:1.5pt" o:hralign="center" o:hrstd="t" o:hr="t" fillcolor="#a0a0a0" stroked="f"/>
+          <v:rect id="_x0000_i1045" style="width:0;height:1.5pt" o:hralign="center" o:hrstd="t" o:hr="t" fillcolor="#a0a0a0" stroked="f"/>
         </w:pict>
       </w:r>
     </w:p>
@@ -5833,7 +5896,7 @@
     <w:p>
       <w:r>
         <w:pict w14:anchorId="78564405">
-          <v:rect id="_x0000_i1155" style="width:0;height:1.5pt" o:hralign="center" o:hrstd="t" o:hr="t" fillcolor="#a0a0a0" stroked="f"/>
+          <v:rect id="_x0000_i1046" style="width:0;height:1.5pt" o:hralign="center" o:hrstd="t" o:hr="t" fillcolor="#a0a0a0" stroked="f"/>
         </w:pict>
       </w:r>
     </w:p>
@@ -5921,7 +5984,7 @@
     <w:p>
       <w:r>
         <w:pict w14:anchorId="2CD36CBF">
-          <v:rect id="_x0000_i1156" style="width:0;height:1.5pt" o:hralign="center" o:hrstd="t" o:hr="t" fillcolor="#a0a0a0" stroked="f"/>
+          <v:rect id="_x0000_i1047" style="width:0;height:1.5pt" o:hralign="center" o:hrstd="t" o:hr="t" fillcolor="#a0a0a0" stroked="f"/>
         </w:pict>
       </w:r>
     </w:p>
@@ -5976,11 +6039,7 @@
         <w:t>AI Action:</w:t>
       </w:r>
       <w:r>
-        <w:t xml:space="preserve"> Give compliance-safe answer: no guarantees, all investments carry risk, fund </w:t>
-      </w:r>
-      <w:r>
-        <w:lastRenderedPageBreak/>
-        <w:t>uses diversification and underwriting.</w:t>
+        <w:t xml:space="preserve"> Give compliance-safe answer: no guarantees, all investments carry risk, fund uses diversification and underwriting.</w:t>
       </w:r>
       <w:r>
         <w:br/>
@@ -6007,7 +6066,7 @@
     <w:p>
       <w:r>
         <w:pict w14:anchorId="74E24B63">
-          <v:rect id="_x0000_i1157" style="width:0;height:1.5pt" o:hralign="center" o:hrstd="t" o:hr="t" fillcolor="#a0a0a0" stroked="f"/>
+          <v:rect id="_x0000_i1048" style="width:0;height:1.5pt" o:hralign="center" o:hrstd="t" o:hr="t" fillcolor="#a0a0a0" stroked="f"/>
         </w:pict>
       </w:r>
     </w:p>
@@ -6089,7 +6148,7 @@
     <w:p>
       <w:r>
         <w:pict w14:anchorId="470193EC">
-          <v:rect id="_x0000_i1158" style="width:0;height:1.5pt" o:hralign="center" o:hrstd="t" o:hr="t" fillcolor="#a0a0a0" stroked="f"/>
+          <v:rect id="_x0000_i1049" style="width:0;height:1.5pt" o:hralign="center" o:hrstd="t" o:hr="t" fillcolor="#a0a0a0" stroked="f"/>
         </w:pict>
       </w:r>
     </w:p>
@@ -6127,6 +6186,7 @@
           <w:b/>
           <w:bCs/>
         </w:rPr>
+        <w:lastRenderedPageBreak/>
         <w:t>Trigger:</w:t>
       </w:r>
       <w:r>
@@ -6193,7 +6253,7 @@
     <w:p>
       <w:r>
         <w:pict w14:anchorId="717B2E33">
-          <v:rect id="_x0000_i1159" style="width:0;height:1.5pt" o:hralign="center" o:hrstd="t" o:hr="t" fillcolor="#a0a0a0" stroked="f"/>
+          <v:rect id="_x0000_i1050" style="width:0;height:1.5pt" o:hralign="center" o:hrstd="t" o:hr="t" fillcolor="#a0a0a0" stroked="f"/>
         </w:pict>
       </w:r>
     </w:p>
@@ -6303,7 +6363,7 @@
     <w:p>
       <w:r>
         <w:pict w14:anchorId="6B8E48F8">
-          <v:rect id="_x0000_i1160" style="width:0;height:1.5pt" o:hralign="center" o:hrstd="t" o:hr="t" fillcolor="#a0a0a0" stroked="f"/>
+          <v:rect id="_x0000_i1051" style="width:0;height:1.5pt" o:hralign="center" o:hrstd="t" o:hr="t" fillcolor="#a0a0a0" stroked="f"/>
         </w:pict>
       </w:r>
     </w:p>
@@ -6341,7 +6401,6 @@
           <w:b/>
           <w:bCs/>
         </w:rPr>
-        <w:lastRenderedPageBreak/>
         <w:t>Trigger:</w:t>
       </w:r>
       <w:r>
@@ -6386,7 +6445,7 @@
     <w:p>
       <w:r>
         <w:pict w14:anchorId="710AE7AE">
-          <v:rect id="_x0000_i1161" style="width:0;height:1.5pt" o:hralign="center" o:hrstd="t" o:hr="t" fillcolor="#a0a0a0" stroked="f"/>
+          <v:rect id="_x0000_i1052" style="width:0;height:1.5pt" o:hralign="center" o:hrstd="t" o:hr="t" fillcolor="#a0a0a0" stroked="f"/>
         </w:pict>
       </w:r>
     </w:p>
@@ -6508,6 +6567,7 @@
         <w:spacing w:after="300"/>
       </w:pPr>
       <w:r>
+        <w:lastRenderedPageBreak/>
         <w:t>Fallback voicemail or message capture: TBD</w:t>
       </w:r>
     </w:p>
@@ -6590,7 +6650,7 @@
     <w:p>
       <w:r>
         <w:pict w14:anchorId="3FB16B98">
-          <v:rect id="_x0000_i1162" style="width:0;height:1.5pt" o:hralign="center" o:hrstd="t" o:hr="t" fillcolor="#a0a0a0" stroked="f"/>
+          <v:rect id="_x0000_i1053" style="width:0;height:1.5pt" o:hralign="center" o:hrstd="t" o:hr="t" fillcolor="#a0a0a0" stroked="f"/>
         </w:pict>
       </w:r>
     </w:p>
@@ -6716,7 +6776,6 @@
         </w:numPr>
       </w:pPr>
       <w:r>
-        <w:lastRenderedPageBreak/>
         <w:t>Email</w:t>
       </w:r>
     </w:p>
@@ -6801,7 +6860,7 @@
     <w:p>
       <w:r>
         <w:pict w14:anchorId="10D10774">
-          <v:rect id="_x0000_i1163" style="width:0;height:1.5pt" o:hralign="center" o:hrstd="t" o:hr="t" fillcolor="#a0a0a0" stroked="f"/>
+          <v:rect id="_x0000_i1054" style="width:0;height:1.5pt" o:hralign="center" o:hrstd="t" o:hr="t" fillcolor="#a0a0a0" stroked="f"/>
         </w:pict>
       </w:r>
     </w:p>
@@ -6894,6 +6953,7 @@
         <w:spacing w:before="300" w:after="300"/>
       </w:pPr>
       <w:r>
+        <w:lastRenderedPageBreak/>
         <w:t>AI/email follow-up should be segmented by audience:</w:t>
       </w:r>
     </w:p>
@@ -7113,7 +7173,6 @@
         </w:numPr>
       </w:pPr>
       <w:r>
-        <w:lastRenderedPageBreak/>
         <w:t>Use compliance-safe language</w:t>
       </w:r>
     </w:p>
@@ -7313,6 +7372,7 @@
         </w:numPr>
       </w:pPr>
       <w:r>
+        <w:lastRenderedPageBreak/>
         <w:t>Wants Info</w:t>
       </w:r>
     </w:p>

</xml_diff>